<commit_message>
docs: regenerate report with 12pt high-clarity typography and 300 DPI ultra-clear diagrams
</commit_message>
<xml_diff>
--- a/AI_Sales_Agent_Project_Report.docx
+++ b/AI_Sales_Agent_Project_Report.docx
@@ -9783,7 +9783,7 @@
       <w:r>
         <w:drawing>
           <wp:inline xmlns:a="http://schemas.openxmlformats.org/drawingml/2006/main" xmlns:pic="http://schemas.openxmlformats.org/drawingml/2006/picture">
-            <wp:extent cx="5852160" cy="6572319"/>
+            <wp:extent cx="5943600" cy="6543964"/>
             <wp:docPr id="1" name="Picture 1"/>
             <wp:cNvGraphicFramePr>
               <a:graphicFrameLocks noChangeAspect="1"/>
@@ -9804,7 +9804,7 @@
                   <pic:spPr>
                     <a:xfrm>
                       <a:off x="0" y="0"/>
-                      <a:ext cx="5852160" cy="6572319"/>
+                      <a:ext cx="5943600" cy="6543964"/>
                     </a:xfrm>
                     <a:prstGeom prst="rect"/>
                   </pic:spPr>
@@ -9856,7 +9856,7 @@
       <w:r>
         <w:drawing>
           <wp:inline xmlns:a="http://schemas.openxmlformats.org/drawingml/2006/main" xmlns:pic="http://schemas.openxmlformats.org/drawingml/2006/picture">
-            <wp:extent cx="5486400" cy="6040582"/>
+            <wp:extent cx="5943600" cy="6543964"/>
             <wp:docPr id="2" name="Picture 2"/>
             <wp:cNvGraphicFramePr>
               <a:graphicFrameLocks noChangeAspect="1"/>
@@ -9877,7 +9877,7 @@
                   <pic:spPr>
                     <a:xfrm>
                       <a:off x="0" y="0"/>
-                      <a:ext cx="5486400" cy="6040582"/>
+                      <a:ext cx="5943600" cy="6543964"/>
                     </a:xfrm>
                     <a:prstGeom prst="rect"/>
                   </pic:spPr>
@@ -9929,7 +9929,7 @@
       <w:r>
         <w:drawing>
           <wp:inline xmlns:a="http://schemas.openxmlformats.org/drawingml/2006/main" xmlns:pic="http://schemas.openxmlformats.org/drawingml/2006/picture">
-            <wp:extent cx="5486400" cy="6040582"/>
+            <wp:extent cx="5943600" cy="6633301"/>
             <wp:docPr id="3" name="Picture 3"/>
             <wp:cNvGraphicFramePr>
               <a:graphicFrameLocks noChangeAspect="1"/>
@@ -9950,7 +9950,7 @@
                   <pic:spPr>
                     <a:xfrm>
                       <a:off x="0" y="0"/>
-                      <a:ext cx="5486400" cy="6040582"/>
+                      <a:ext cx="5943600" cy="6633301"/>
                     </a:xfrm>
                     <a:prstGeom prst="rect"/>
                   </pic:spPr>
@@ -10002,7 +10002,7 @@
       <w:r>
         <w:drawing>
           <wp:inline xmlns:a="http://schemas.openxmlformats.org/drawingml/2006/main" xmlns:pic="http://schemas.openxmlformats.org/drawingml/2006/picture">
-            <wp:extent cx="5486400" cy="6719299"/>
+            <wp:extent cx="5943600" cy="6543964"/>
             <wp:docPr id="4" name="Picture 4"/>
             <wp:cNvGraphicFramePr>
               <a:graphicFrameLocks noChangeAspect="1"/>
@@ -10023,7 +10023,7 @@
                   <pic:spPr>
                     <a:xfrm>
                       <a:off x="0" y="0"/>
-                      <a:ext cx="5486400" cy="6719299"/>
+                      <a:ext cx="5943600" cy="6543964"/>
                     </a:xfrm>
                     <a:prstGeom prst="rect"/>
                   </pic:spPr>
@@ -10075,7 +10075,7 @@
       <w:r>
         <w:drawing>
           <wp:inline xmlns:a="http://schemas.openxmlformats.org/drawingml/2006/main" xmlns:pic="http://schemas.openxmlformats.org/drawingml/2006/picture">
-            <wp:extent cx="4246279" cy="6583680"/>
+            <wp:extent cx="5943600" cy="6543964"/>
             <wp:docPr id="5" name="Picture 5"/>
             <wp:cNvGraphicFramePr>
               <a:graphicFrameLocks noChangeAspect="1"/>
@@ -10096,7 +10096,7 @@
                   <pic:spPr>
                     <a:xfrm>
                       <a:off x="0" y="0"/>
-                      <a:ext cx="4246279" cy="6583680"/>
+                      <a:ext cx="5943600" cy="6543964"/>
                     </a:xfrm>
                     <a:prstGeom prst="rect"/>
                   </pic:spPr>
@@ -11995,7 +11995,7 @@
     </w:pPr>
     <w:rPr>
       <w:rFonts w:ascii="Times New Roman" w:hAnsi="Times New Roman"/>
-      <w:sz w:val="22"/>
+      <w:sz w:val="24"/>
     </w:rPr>
   </w:style>
   <w:style w:type="paragraph" w:styleId="Header">

</xml_diff>

<commit_message>
chore: update academic report with 300DPI crystal-clear AI sales diagrams and polished TOC
</commit_message>
<xml_diff>
--- a/AI_Sales_Agent_Project_Report.docx
+++ b/AI_Sales_Agent_Project_Report.docx
@@ -232,7 +232,7 @@
           <w:b/>
           <w:sz w:val="22"/>
         </w:rPr>
-        <w:t>LIST OF TABELS</w:t>
+        <w:t>LIST OF TABLES</w:t>
       </w:r>
       <w:r>
         <w:rPr>
@@ -584,20 +584,6 @@
     </w:p>
     <w:p>
       <w:pPr>
-        <w:spacing w:line="276" w:lineRule="auto" w:before="30" w:after="40"/>
-        <w:ind w:left="504"/>
-      </w:pPr>
-      <w:r>
-        <w:rPr>
-          <w:rFonts w:ascii="Times New Roman" w:hAnsi="Times New Roman"/>
-          <w:b w:val="0"/>
-          <w:sz w:val="22"/>
-        </w:rPr>
-        <w:t>2.3</w:t>
-      </w:r>
-    </w:p>
-    <w:p>
-      <w:pPr>
         <w:tabs>
           <w:tab w:pos="9360" w:val="right" w:leader="dot"/>
         </w:tabs>
@@ -636,7 +622,7 @@
           <w:b w:val="0"/>
           <w:sz w:val="22"/>
         </w:rPr>
-        <w:t>2.4   Project Planning Objectives</w:t>
+        <w:t>3.1   Project Planning Objectives</w:t>
       </w:r>
       <w:r>
         <w:rPr>
@@ -662,7 +648,7 @@
           <w:b w:val="0"/>
           <w:sz w:val="22"/>
         </w:rPr>
-        <w:t>2.4.1   Software Scope</w:t>
+        <w:t>3.1.1   Software Scope</w:t>
       </w:r>
       <w:r>
         <w:rPr>
@@ -688,7 +674,7 @@
           <w:b w:val="0"/>
           <w:sz w:val="22"/>
         </w:rPr>
-        <w:t>2.4.2   Resource</w:t>
+        <w:t>3.1.2   Resource Allocation</w:t>
       </w:r>
       <w:r>
         <w:rPr>
@@ -714,7 +700,7 @@
           <w:b w:val="0"/>
           <w:sz w:val="22"/>
         </w:rPr>
-        <w:t>2.4.2.1   Human Resource</w:t>
+        <w:t>3.1.2.1   Human Resource</w:t>
       </w:r>
       <w:r>
         <w:rPr>
@@ -740,7 +726,7 @@
           <w:b w:val="0"/>
           <w:sz w:val="22"/>
         </w:rPr>
-        <w:t>2.4.2.2   Reusable Software Resources</w:t>
+        <w:t>3.1.2.2   Reusable Software Resources</w:t>
       </w:r>
       <w:r>
         <w:rPr>
@@ -766,7 +752,7 @@
           <w:b w:val="0"/>
           <w:sz w:val="22"/>
         </w:rPr>
-        <w:t>2.4.2.3   Environment Resource</w:t>
+        <w:t>3.1.2.3   Environmental Resource</w:t>
       </w:r>
       <w:r>
         <w:rPr>
@@ -792,7 +778,7 @@
           <w:b w:val="0"/>
           <w:sz w:val="22"/>
         </w:rPr>
-        <w:t>2.4.3   Project Development Approach</w:t>
+        <w:t>3.1.3   Project Development Approach</w:t>
       </w:r>
       <w:r>
         <w:rPr>
@@ -818,7 +804,7 @@
           <w:b w:val="0"/>
           <w:sz w:val="22"/>
         </w:rPr>
-        <w:t>2.5   Project Scheduling</w:t>
+        <w:t>3.2   Project Scheduling</w:t>
       </w:r>
       <w:r>
         <w:rPr>
@@ -844,7 +830,7 @@
           <w:b w:val="0"/>
           <w:sz w:val="22"/>
         </w:rPr>
-        <w:t>2.5.1   Basic Principal</w:t>
+        <w:t>3.2.1   Basic Principles</w:t>
       </w:r>
       <w:r>
         <w:rPr>
@@ -875,7 +861,7 @@
           <w:b w:val="0"/>
           <w:sz w:val="22"/>
         </w:rPr>
-        <w:t>2.5.2   Compartmentalization</w:t>
+        <w:t>3.2.2   Compartmentalization</w:t>
       </w:r>
       <w:r>
         <w:rPr>
@@ -901,7 +887,7 @@
           <w:b w:val="0"/>
           <w:sz w:val="22"/>
         </w:rPr>
-        <w:t>2.5.3   Work breakdown structure</w:t>
+        <w:t>3.2.3   Work Breakdown Structure</w:t>
       </w:r>
       <w:r>
         <w:rPr>
@@ -927,7 +913,7 @@
           <w:b w:val="0"/>
           <w:sz w:val="22"/>
         </w:rPr>
-        <w:t>2.5.4   Project Organization</w:t>
+        <w:t>3.2.4   Project Organization</w:t>
       </w:r>
       <w:r>
         <w:rPr>
@@ -953,7 +939,7 @@
           <w:b w:val="0"/>
           <w:sz w:val="22"/>
         </w:rPr>
-        <w:t>2.5.5   TimeLine Chart</w:t>
+        <w:t>3.2.5   Timeline Chart</w:t>
       </w:r>
       <w:r>
         <w:rPr>
@@ -979,7 +965,7 @@
           <w:b w:val="0"/>
           <w:sz w:val="22"/>
         </w:rPr>
-        <w:t>2.5.5.1   Time Allocation</w:t>
+        <w:t>3.2.5.1   Time Allocation</w:t>
       </w:r>
       <w:r>
         <w:rPr>
@@ -1005,7 +991,7 @@
           <w:b w:val="0"/>
           <w:sz w:val="22"/>
         </w:rPr>
-        <w:t>2.5.5.2   Task Sets</w:t>
+        <w:t>3.2.5.2   Task Sets</w:t>
       </w:r>
       <w:r>
         <w:rPr>
@@ -1031,7 +1017,7 @@
           <w:b w:val="0"/>
           <w:sz w:val="22"/>
         </w:rPr>
-        <w:t>2.6   Risk Management</w:t>
+        <w:t>3.3   Risk Management</w:t>
       </w:r>
       <w:r>
         <w:rPr>
@@ -1057,7 +1043,7 @@
           <w:b w:val="0"/>
           <w:sz w:val="22"/>
         </w:rPr>
-        <w:t>2.6.1   Risk Identification</w:t>
+        <w:t>3.3.1   Risk Identification</w:t>
       </w:r>
       <w:r>
         <w:rPr>
@@ -1083,7 +1069,7 @@
           <w:b w:val="0"/>
           <w:sz w:val="22"/>
         </w:rPr>
-        <w:t>2.6.1.1   Risk Identification artifacts</w:t>
+        <w:t>3.3.1.1   Risk Identification Artifacts</w:t>
       </w:r>
       <w:r>
         <w:rPr>
@@ -1109,7 +1095,7 @@
           <w:b w:val="0"/>
           <w:sz w:val="22"/>
         </w:rPr>
-        <w:t>2.6.2   Risk Projection</w:t>
+        <w:t>3.3.2   Risk Projection &amp; Mitigation</w:t>
       </w:r>
       <w:r>
         <w:rPr>
@@ -1530,7 +1516,7 @@
           <w:b w:val="0"/>
           <w:sz w:val="22"/>
         </w:rPr>
-        <w:t>4.2.1   Technical Feasibility</w:t>
+        <w:t>5.5.1   Technical Feasibility</w:t>
       </w:r>
       <w:r>
         <w:rPr>
@@ -1556,7 +1542,7 @@
           <w:b w:val="0"/>
           <w:sz w:val="22"/>
         </w:rPr>
-        <w:t>4.2.2   Operational Feasibility</w:t>
+        <w:t>5.5.2   Operational Feasibility</w:t>
       </w:r>
       <w:r>
         <w:rPr>
@@ -1582,7 +1568,7 @@
           <w:b w:val="0"/>
           <w:sz w:val="22"/>
         </w:rPr>
-        <w:t>4.2.3   Economical Feasibility</w:t>
+        <w:t>5.5.3   Economical Feasibility</w:t>
       </w:r>
       <w:r>
         <w:rPr>
@@ -1608,7 +1594,7 @@
           <w:b w:val="0"/>
           <w:sz w:val="22"/>
         </w:rPr>
-        <w:t>4.2.4   Schedule Feasibility</w:t>
+        <w:t>5.5.4   Schedule Feasibility</w:t>
       </w:r>
       <w:r>
         <w:rPr>
@@ -1660,7 +1646,7 @@
           <w:b/>
           <w:sz w:val="22"/>
         </w:rPr>
-        <w:t>CHAPTER 6 DETAIL DISCRIPTION</w:t>
+        <w:t>CHAPTER 6 DETAILED DESCRIPTION</w:t>
       </w:r>
       <w:r>
         <w:rPr>
@@ -1686,7 +1672,7 @@
           <w:b w:val="0"/>
           <w:sz w:val="22"/>
         </w:rPr>
-        <w:t>6.1   User/Employee Module</w:t>
+        <w:t>6.1   Super Admin &amp; Merchant Management</w:t>
       </w:r>
       <w:r>
         <w:rPr>
@@ -1712,7 +1698,7 @@
           <w:b w:val="0"/>
           <w:sz w:val="22"/>
         </w:rPr>
-        <w:t>6.2   Company Module</w:t>
+        <w:t>6.2   Autonomous Sales Agent &amp; Closer</w:t>
       </w:r>
       <w:r>
         <w:rPr>
@@ -1738,7 +1724,7 @@
           <w:b w:val="0"/>
           <w:sz w:val="22"/>
         </w:rPr>
-        <w:t>6.3   Administrator Module</w:t>
+        <w:t>6.3   Dynamic PDF RAG &amp; Catalog Ingestion</w:t>
       </w:r>
       <w:r>
         <w:rPr>
@@ -1764,111 +1750,7 @@
           <w:b/>
           <w:sz w:val="22"/>
         </w:rPr>
-        <w:t>CHAPTER 7 Testing</w:t>
-      </w:r>
-      <w:r>
-        <w:rPr>
-          <w:rFonts w:ascii="Times New Roman" w:hAnsi="Times New Roman"/>
-          <w:b/>
-          <w:sz w:val="22"/>
-        </w:rPr>
-        <w:tab/>
-        <w:t>51</w:t>
-      </w:r>
-    </w:p>
-    <w:p>
-      <w:pPr>
-        <w:tabs>
-          <w:tab w:pos="9360" w:val="right" w:leader="dot"/>
-        </w:tabs>
-        <w:spacing w:line="276" w:lineRule="auto" w:before="30" w:after="40"/>
-        <w:ind w:left="504"/>
-      </w:pPr>
-      <w:r>
-        <w:rPr>
-          <w:rFonts w:ascii="Times New Roman" w:hAnsi="Times New Roman"/>
-          <w:b w:val="0"/>
-          <w:sz w:val="22"/>
-        </w:rPr>
-        <w:t>7.1   Black-Box Testing</w:t>
-      </w:r>
-      <w:r>
-        <w:rPr>
-          <w:rFonts w:ascii="Times New Roman" w:hAnsi="Times New Roman"/>
-          <w:b w:val="0"/>
-          <w:sz w:val="22"/>
-        </w:rPr>
-        <w:tab/>
-        <w:t>52</w:t>
-      </w:r>
-    </w:p>
-    <w:p>
-      <w:pPr>
-        <w:tabs>
-          <w:tab w:pos="9360" w:val="right" w:leader="dot"/>
-        </w:tabs>
-        <w:spacing w:line="276" w:lineRule="auto" w:before="30" w:after="40"/>
-        <w:ind w:left="504"/>
-      </w:pPr>
-      <w:r>
-        <w:rPr>
-          <w:rFonts w:ascii="Times New Roman" w:hAnsi="Times New Roman"/>
-          <w:b w:val="0"/>
-          <w:sz w:val="22"/>
-        </w:rPr>
-        <w:t>7.2   White-Box Testing</w:t>
-      </w:r>
-      <w:r>
-        <w:rPr>
-          <w:rFonts w:ascii="Times New Roman" w:hAnsi="Times New Roman"/>
-          <w:b w:val="0"/>
-          <w:sz w:val="22"/>
-        </w:rPr>
-        <w:tab/>
-        <w:t>53</w:t>
-      </w:r>
-    </w:p>
-    <w:p>
-      <w:pPr>
-        <w:tabs>
-          <w:tab w:pos="9360" w:val="right" w:leader="dot"/>
-        </w:tabs>
-        <w:spacing w:line="276" w:lineRule="auto" w:before="30" w:after="40"/>
-        <w:ind w:left="504"/>
-      </w:pPr>
-      <w:r>
-        <w:rPr>
-          <w:rFonts w:ascii="Times New Roman" w:hAnsi="Times New Roman"/>
-          <w:b w:val="0"/>
-          <w:sz w:val="22"/>
-        </w:rPr>
-        <w:t>7.3   Test Cases</w:t>
-      </w:r>
-      <w:r>
-        <w:rPr>
-          <w:rFonts w:ascii="Times New Roman" w:hAnsi="Times New Roman"/>
-          <w:b w:val="0"/>
-          <w:sz w:val="22"/>
-        </w:rPr>
-        <w:tab/>
-        <w:t>54</w:t>
-      </w:r>
-    </w:p>
-    <w:p>
-      <w:pPr>
-        <w:tabs>
-          <w:tab w:pos="9360" w:val="right" w:leader="dot"/>
-        </w:tabs>
-        <w:spacing w:line="276" w:lineRule="auto" w:before="30" w:after="40"/>
-        <w:ind w:left="0"/>
-      </w:pPr>
-      <w:r>
-        <w:rPr>
-          <w:rFonts w:ascii="Times New Roman" w:hAnsi="Times New Roman"/>
-          <w:b/>
-          <w:sz w:val="22"/>
-        </w:rPr>
-        <w:t>CHAPTER 8 SYSTEM DESIGN</w:t>
+        <w:t>CHAPTER 7 TESTING</w:t>
       </w:r>
       <w:r>
         <w:rPr>
@@ -1894,7 +1776,7 @@
           <w:b w:val="0"/>
           <w:sz w:val="22"/>
         </w:rPr>
-        <w:t>8.1   Class Diagram</w:t>
+        <w:t>7.1   Black-Box Testing</w:t>
       </w:r>
       <w:r>
         <w:rPr>
@@ -1920,7 +1802,7 @@
           <w:b w:val="0"/>
           <w:sz w:val="22"/>
         </w:rPr>
-        <w:t>8.2   Use – Case Diagram</w:t>
+        <w:t>7.2   White-Box Testing</w:t>
       </w:r>
       <w:r>
         <w:rPr>
@@ -1946,7 +1828,59 @@
           <w:b w:val="0"/>
           <w:sz w:val="22"/>
         </w:rPr>
-        <w:t>8.3   Sequence Diagram</w:t>
+        <w:t>7.3   Test Cases</w:t>
+      </w:r>
+      <w:r>
+        <w:rPr>
+          <w:rFonts w:ascii="Times New Roman" w:hAnsi="Times New Roman"/>
+          <w:b w:val="0"/>
+          <w:sz w:val="22"/>
+        </w:rPr>
+        <w:tab/>
+        <w:t>58</w:t>
+      </w:r>
+    </w:p>
+    <w:p>
+      <w:pPr>
+        <w:tabs>
+          <w:tab w:pos="9360" w:val="right" w:leader="dot"/>
+        </w:tabs>
+        <w:spacing w:line="276" w:lineRule="auto" w:before="30" w:after="40"/>
+        <w:ind w:left="0"/>
+      </w:pPr>
+      <w:r>
+        <w:rPr>
+          <w:rFonts w:ascii="Times New Roman" w:hAnsi="Times New Roman"/>
+          <w:b/>
+          <w:sz w:val="22"/>
+        </w:rPr>
+        <w:t>CHAPTER 8 SYSTEM DESIGN</w:t>
+      </w:r>
+      <w:r>
+        <w:rPr>
+          <w:rFonts w:ascii="Times New Roman" w:hAnsi="Times New Roman"/>
+          <w:b/>
+          <w:sz w:val="22"/>
+        </w:rPr>
+        <w:tab/>
+        <w:t>60</w:t>
+      </w:r>
+    </w:p>
+    <w:p>
+      <w:pPr>
+        <w:tabs>
+          <w:tab w:pos="9360" w:val="right" w:leader="dot"/>
+        </w:tabs>
+        <w:spacing w:line="276" w:lineRule="auto" w:before="30" w:after="40"/>
+        <w:ind w:left="504"/>
+      </w:pPr>
+      <w:r>
+        <w:rPr>
+          <w:rFonts w:ascii="Times New Roman" w:hAnsi="Times New Roman"/>
+          <w:b w:val="0"/>
+          <w:sz w:val="22"/>
+        </w:rPr>
+        <w:t>8.1   Class Diagram</w:t>
       </w:r>
       <w:r>
         <w:rPr>
@@ -1972,6 +1906,58 @@
           <w:b w:val="0"/>
           <w:sz w:val="22"/>
         </w:rPr>
+        <w:t>8.2   Use - Case Diagram</w:t>
+      </w:r>
+      <w:r>
+        <w:rPr>
+          <w:rFonts w:ascii="Times New Roman" w:hAnsi="Times New Roman"/>
+          <w:b w:val="0"/>
+          <w:sz w:val="22"/>
+        </w:rPr>
+        <w:tab/>
+        <w:t>62</w:t>
+      </w:r>
+    </w:p>
+    <w:p>
+      <w:pPr>
+        <w:tabs>
+          <w:tab w:pos="9360" w:val="right" w:leader="dot"/>
+        </w:tabs>
+        <w:spacing w:line="276" w:lineRule="auto" w:before="30" w:after="40"/>
+        <w:ind w:left="504"/>
+      </w:pPr>
+      <w:r>
+        <w:rPr>
+          <w:rFonts w:ascii="Times New Roman" w:hAnsi="Times New Roman"/>
+          <w:b w:val="0"/>
+          <w:sz w:val="22"/>
+        </w:rPr>
+        <w:t>8.3   Sequence Diagram</w:t>
+      </w:r>
+      <w:r>
+        <w:rPr>
+          <w:rFonts w:ascii="Times New Roman" w:hAnsi="Times New Roman"/>
+          <w:b w:val="0"/>
+          <w:sz w:val="22"/>
+        </w:rPr>
+        <w:tab/>
+        <w:t>63</w:t>
+      </w:r>
+    </w:p>
+    <w:p>
+      <w:pPr>
+        <w:tabs>
+          <w:tab w:pos="9360" w:val="right" w:leader="dot"/>
+        </w:tabs>
+        <w:spacing w:line="276" w:lineRule="auto" w:before="30" w:after="40"/>
+        <w:ind w:left="504"/>
+      </w:pPr>
+      <w:r>
+        <w:rPr>
+          <w:rFonts w:ascii="Times New Roman" w:hAnsi="Times New Roman"/>
+          <w:b w:val="0"/>
+          <w:sz w:val="22"/>
+        </w:rPr>
         <w:t>8.4   Activity Diagram</w:t>
       </w:r>
       <w:r>
@@ -2159,7 +2145,7 @@
           <w:b/>
           <w:sz w:val="22"/>
         </w:rPr>
-        <w:t>CHAPTER 11 Appendices</w:t>
+        <w:t>CHAPTER 11 APPENDICES</w:t>
       </w:r>
       <w:r>
         <w:rPr>
@@ -11069,7 +11055,7 @@
           </w:tcPr>
           <w:p>
             <w:r>
-              <w:t>https://ai-sales-agent-platform.onrender.com</w:t>
+              <w:t>https://ai-sales-agent-platform.vercel.app</w:t>
             </w:r>
           </w:p>
         </w:tc>
@@ -11122,7 +11108,7 @@
           </w:tcPr>
           <w:p>
             <w:r>
-              <w:t>https://ai-sales-agent-platform.onrender.com/visitor-demo.html</w:t>
+              <w:t>https://ai-sales-agent-platform.vercel.app/visitor-demo.html</w:t>
             </w:r>
           </w:p>
         </w:tc>

</xml_diff>

<commit_message>
fix: restore exact 56-page reference report layout and AI sales diagrams
</commit_message>
<xml_diff>
--- a/AI_Sales_Agent_Project_Report.docx
+++ b/AI_Sales_Agent_Project_Report.docx
@@ -9769,7 +9769,7 @@
       <w:r>
         <w:drawing>
           <wp:inline xmlns:a="http://schemas.openxmlformats.org/drawingml/2006/main" xmlns:pic="http://schemas.openxmlformats.org/drawingml/2006/picture">
-            <wp:extent cx="5943600" cy="6543964"/>
+            <wp:extent cx="5669280" cy="6309920"/>
             <wp:docPr id="1" name="Picture 1"/>
             <wp:cNvGraphicFramePr>
               <a:graphicFrameLocks noChangeAspect="1"/>
@@ -9790,7 +9790,7 @@
                   <pic:spPr>
                     <a:xfrm>
                       <a:off x="0" y="0"/>
-                      <a:ext cx="5943600" cy="6543964"/>
+                      <a:ext cx="5669280" cy="6309920"/>
                     </a:xfrm>
                     <a:prstGeom prst="rect"/>
                   </pic:spPr>
@@ -9842,7 +9842,7 @@
       <w:r>
         <w:drawing>
           <wp:inline xmlns:a="http://schemas.openxmlformats.org/drawingml/2006/main" xmlns:pic="http://schemas.openxmlformats.org/drawingml/2006/picture">
-            <wp:extent cx="5943600" cy="6543964"/>
+            <wp:extent cx="5303520" cy="5839229"/>
             <wp:docPr id="2" name="Picture 2"/>
             <wp:cNvGraphicFramePr>
               <a:graphicFrameLocks noChangeAspect="1"/>
@@ -9863,7 +9863,7 @@
                   <pic:spPr>
                     <a:xfrm>
                       <a:off x="0" y="0"/>
-                      <a:ext cx="5943600" cy="6543964"/>
+                      <a:ext cx="5303520" cy="5839229"/>
                     </a:xfrm>
                     <a:prstGeom prst="rect"/>
                   </pic:spPr>
@@ -9915,7 +9915,7 @@
       <w:r>
         <w:drawing>
           <wp:inline xmlns:a="http://schemas.openxmlformats.org/drawingml/2006/main" xmlns:pic="http://schemas.openxmlformats.org/drawingml/2006/picture">
-            <wp:extent cx="5943600" cy="6633301"/>
+            <wp:extent cx="5303520" cy="5839229"/>
             <wp:docPr id="3" name="Picture 3"/>
             <wp:cNvGraphicFramePr>
               <a:graphicFrameLocks noChangeAspect="1"/>
@@ -9936,7 +9936,7 @@
                   <pic:spPr>
                     <a:xfrm>
                       <a:off x="0" y="0"/>
-                      <a:ext cx="5943600" cy="6633301"/>
+                      <a:ext cx="5303520" cy="5839229"/>
                     </a:xfrm>
                     <a:prstGeom prst="rect"/>
                   </pic:spPr>
@@ -9988,7 +9988,7 @@
       <w:r>
         <w:drawing>
           <wp:inline xmlns:a="http://schemas.openxmlformats.org/drawingml/2006/main" xmlns:pic="http://schemas.openxmlformats.org/drawingml/2006/picture">
-            <wp:extent cx="5943600" cy="6543964"/>
+            <wp:extent cx="5029200" cy="6159357"/>
             <wp:docPr id="4" name="Picture 4"/>
             <wp:cNvGraphicFramePr>
               <a:graphicFrameLocks noChangeAspect="1"/>
@@ -10009,7 +10009,7 @@
                   <pic:spPr>
                     <a:xfrm>
                       <a:off x="0" y="0"/>
-                      <a:ext cx="5943600" cy="6543964"/>
+                      <a:ext cx="5029200" cy="6159357"/>
                     </a:xfrm>
                     <a:prstGeom prst="rect"/>
                   </pic:spPr>
@@ -10061,7 +10061,7 @@
       <w:r>
         <w:drawing>
           <wp:inline xmlns:a="http://schemas.openxmlformats.org/drawingml/2006/main" xmlns:pic="http://schemas.openxmlformats.org/drawingml/2006/picture">
-            <wp:extent cx="5943600" cy="6543964"/>
+            <wp:extent cx="5647469" cy="6217920"/>
             <wp:docPr id="5" name="Picture 5"/>
             <wp:cNvGraphicFramePr>
               <a:graphicFrameLocks noChangeAspect="1"/>
@@ -10082,7 +10082,7 @@
                   <pic:spPr>
                     <a:xfrm>
                       <a:off x="0" y="0"/>
-                      <a:ext cx="5943600" cy="6543964"/>
+                      <a:ext cx="5647469" cy="6217920"/>
                     </a:xfrm>
                     <a:prstGeom prst="rect"/>
                   </pic:spPr>
@@ -11981,7 +11981,7 @@
     </w:pPr>
     <w:rPr>
       <w:rFonts w:ascii="Times New Roman" w:hAnsi="Times New Roman"/>
-      <w:sz w:val="24"/>
+      <w:sz w:val="22"/>
     </w:rPr>
   </w:style>
   <w:style w:type="paragraph" w:styleId="Header">

</xml_diff>